<commit_message>
create project router for functions, but schematic is not finish
</commit_message>
<xml_diff>
--- a/001 - estudo pessoal/005 - star topology using switch/Manual Passo a Passo topologia estrela usando switch.docx
+++ b/001 - estudo pessoal/005 - star topology using switch/Manual Passo a Passo topologia estrela usando switch.docx
@@ -632,8 +632,22 @@
       </w:r>
     </w:p>
     <w:p/>
-    <w:p>
-      <w:r>
+    <w:p/>
+    <w:p/>
+    <w:p/>
+    <w:p/>
+    <w:p/>
+    <w:p/>
+    <w:p/>
+    <w:p/>
+    <w:p/>
+    <w:p/>
+    <w:p/>
+    <w:p/>
+    <w:p/>
+    <w:p>
+      <w:r>
+        <w:lastRenderedPageBreak/>
         <w:t xml:space="preserve">2 – </w:t>
       </w:r>
       <w:r>
@@ -642,7 +656,6 @@
     </w:p>
     <w:p>
       <w:r>
-        <w:lastRenderedPageBreak/>
         <w:drawing>
           <wp:inline distT="0" distB="0" distL="0" distR="0" wp14:anchorId="7A4D357B" wp14:editId="331C77BE">
             <wp:extent cx="5400040" cy="5017770"/>
@@ -1028,11 +1041,14 @@
       </w:r>
     </w:p>
     <w:p>
+      <w:pPr>
+        <w:jc w:val="center"/>
+      </w:pPr>
       <w:r>
         <w:drawing>
-          <wp:inline distT="0" distB="0" distL="0" distR="0" wp14:anchorId="69621433" wp14:editId="71930AB1">
-            <wp:extent cx="5400040" cy="4948555"/>
-            <wp:effectExtent l="0" t="0" r="0" b="4445"/>
+          <wp:inline distT="0" distB="0" distL="0" distR="0" wp14:anchorId="69621433" wp14:editId="4521C1A4">
+            <wp:extent cx="5762625" cy="5280825"/>
+            <wp:effectExtent l="0" t="0" r="0" b="0"/>
             <wp:docPr id="2012786050" name="Picture 1"/>
             <wp:cNvGraphicFramePr>
               <a:graphicFrameLocks xmlns:a="http://schemas.openxmlformats.org/drawingml/2006/main" noChangeAspect="1"/>
@@ -1053,7 +1069,7 @@
                   <pic:spPr>
                     <a:xfrm>
                       <a:off x="0" y="0"/>
-                      <a:ext cx="5400040" cy="4948555"/>
+                      <a:ext cx="5766467" cy="5284346"/>
                     </a:xfrm>
                     <a:prstGeom prst="rect">
                       <a:avLst/>
@@ -1066,88 +1082,68 @@
         </w:drawing>
       </w:r>
     </w:p>
+    <w:p/>
+    <w:p/>
+    <w:p/>
+    <w:p/>
+    <w:p/>
+    <w:p/>
+    <w:p/>
+    <w:p/>
+    <w:p/>
+    <w:p/>
     <w:p>
       <w:r>
         <w:t xml:space="preserve">7 – </w:t>
       </w:r>
-    </w:p>
-    <w:p/>
-    <w:p/>
-    <w:p>
-      <w:r>
-        <w:t xml:space="preserve">8 – </w:t>
-      </w:r>
-    </w:p>
-    <w:p/>
-    <w:p>
-      <w:r>
-        <w:t xml:space="preserve">9 – </w:t>
-      </w:r>
-    </w:p>
+      <w:r>
+        <w:t>Montar cenario de testes de mensageria entre as maquinas</w:t>
+      </w:r>
+    </w:p>
+    <w:p>
+      <w:r>
+        <w:drawing>
+          <wp:inline distT="0" distB="0" distL="0" distR="0" wp14:anchorId="0245CC4C" wp14:editId="4AAD95C9">
+            <wp:extent cx="5400040" cy="3569970"/>
+            <wp:effectExtent l="0" t="0" r="0" b="0"/>
+            <wp:docPr id="369739403" name="Picture 1"/>
+            <wp:cNvGraphicFramePr>
+              <a:graphicFrameLocks xmlns:a="http://schemas.openxmlformats.org/drawingml/2006/main" noChangeAspect="1"/>
+            </wp:cNvGraphicFramePr>
+            <a:graphic xmlns:a="http://schemas.openxmlformats.org/drawingml/2006/main">
+              <a:graphicData uri="http://schemas.openxmlformats.org/drawingml/2006/picture">
+                <pic:pic xmlns:pic="http://schemas.openxmlformats.org/drawingml/2006/picture">
+                  <pic:nvPicPr>
+                    <pic:cNvPr id="369739403" name=""/>
+                    <pic:cNvPicPr/>
+                  </pic:nvPicPr>
+                  <pic:blipFill>
+                    <a:blip r:embed="rId14"/>
+                    <a:stretch>
+                      <a:fillRect/>
+                    </a:stretch>
+                  </pic:blipFill>
+                  <pic:spPr>
+                    <a:xfrm>
+                      <a:off x="0" y="0"/>
+                      <a:ext cx="5400040" cy="3569970"/>
+                    </a:xfrm>
+                    <a:prstGeom prst="rect">
+                      <a:avLst/>
+                    </a:prstGeom>
+                  </pic:spPr>
+                </pic:pic>
+              </a:graphicData>
+            </a:graphic>
+          </wp:inline>
+        </w:drawing>
+      </w:r>
+    </w:p>
+    <w:p/>
     <w:p>
       <w:pPr>
         <w:jc w:val="center"/>
       </w:pPr>
-    </w:p>
-    <w:p/>
-    <w:p/>
-    <w:p>
-      <w:r>
-        <w:t xml:space="preserve">10 – </w:t>
-      </w:r>
-    </w:p>
-    <w:p>
-      <w:pPr>
-        <w:jc w:val="center"/>
-      </w:pPr>
-    </w:p>
-    <w:p/>
-    <w:p/>
-    <w:p/>
-    <w:p/>
-    <w:p/>
-    <w:p/>
-    <w:p/>
-    <w:p/>
-    <w:p/>
-    <w:p/>
-    <w:p/>
-    <w:p>
-      <w:r>
-        <w:t xml:space="preserve">11 – </w:t>
-      </w:r>
-    </w:p>
-    <w:p/>
-    <w:p>
-      <w:r>
-        <w:t xml:space="preserve">12 – </w:t>
-      </w:r>
-    </w:p>
-    <w:p>
-      <w:pPr>
-        <w:jc w:val="center"/>
-      </w:pPr>
-    </w:p>
-    <w:p/>
-    <w:p/>
-    <w:p/>
-    <w:p/>
-    <w:p>
-      <w:r>
-        <w:t xml:space="preserve">13- </w:t>
-      </w:r>
-    </w:p>
-    <w:p/>
-    <w:p>
-      <w:r>
-        <w:t xml:space="preserve"> </w:t>
-      </w:r>
-    </w:p>
-    <w:p/>
-    <w:p>
-      <w:r>
-        <w:t xml:space="preserve">14 – </w:t>
-      </w:r>
     </w:p>
     <w:p/>
     <w:p/>

</xml_diff>